<commit_message>
Updated Basic Java Theory Docs
</commit_message>
<xml_diff>
--- a/BasicJavaTheory.docx
+++ b/BasicJavaTheory.docx
@@ -561,7 +561,7 @@
         <mc:AlternateContent>
           <mc:Choice Requires="wpi">
             <w:drawing>
-              <wp:anchor distT="0" distB="0" distL="114300" distR="114300" simplePos="0" relativeHeight="251659264" behindDoc="0" locked="0" layoutInCell="1" allowOverlap="1" wp14:anchorId="6161AC82" wp14:editId="595C9057">
+              <wp:anchor distT="0" distB="0" distL="114300" distR="114300" simplePos="0" relativeHeight="251657216" behindDoc="0" locked="0" layoutInCell="1" allowOverlap="1" wp14:anchorId="6161AC82" wp14:editId="595C9057">
                 <wp:simplePos x="0" y="0"/>
                 <wp:positionH relativeFrom="column">
                   <wp:posOffset>1321035</wp:posOffset>
@@ -596,7 +596,7 @@
           </mc:Choice>
           <mc:Fallback>
             <w:pict>
-              <v:shapetype w14:anchorId="657B4058" id="_x0000_t75" coordsize="21600,21600" o:spt="75" o:preferrelative="t" path="m@4@5l@4@11@9@11@9@5xe" filled="f" stroked="f">
+              <v:shapetype w14:anchorId="536BB911" id="_x0000_t75" coordsize="21600,21600" o:spt="75" o:preferrelative="t" path="m@4@5l@4@11@9@11@9@5xe" filled="f" stroked="f">
                 <v:stroke joinstyle="miter"/>
                 <v:formulas>
                   <v:f eqn="if lineDrawn pixelLineWidth 0"/>
@@ -615,7 +615,7 @@
                 <v:path o:extrusionok="f" gradientshapeok="t" o:connecttype="rect"/>
                 <o:lock v:ext="edit" aspectratio="t"/>
               </v:shapetype>
-              <v:shape id="Ink 112" o:spid="_x0000_s1026" type="#_x0000_t75" style="position:absolute;margin-left:103.65pt;margin-top:2.9pt;width:1.75pt;height:1.05pt;z-index:251659264;visibility:visible;mso-wrap-style:square;mso-wrap-distance-left:9pt;mso-wrap-distance-top:0;mso-wrap-distance-right:9pt;mso-wrap-distance-bottom:0;mso-position-horizontal:absolute;mso-position-horizontal-relative:text;mso-position-vertical:absolute;mso-position-vertical-relative:text" o:gfxdata="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">
+              <v:shape id="Ink 112" o:spid="_x0000_s1026" type="#_x0000_t75" style="position:absolute;margin-left:103.65pt;margin-top:2.9pt;width:1.75pt;height:1.05pt;z-index:251657216;visibility:visible;mso-wrap-style:square;mso-wrap-distance-left:9pt;mso-wrap-distance-top:0;mso-wrap-distance-right:9pt;mso-wrap-distance-bottom:0;mso-position-horizontal:absolute;mso-position-horizontal-relative:text;mso-position-vertical:absolute;mso-position-vertical-relative:text" o:gfxdata="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">
                 <v:imagedata r:id="rId6" o:title=""/>
                 <o:lock v:ext="edit" rotation="t" aspectratio="f"/>
               </v:shape>
@@ -1596,17 +1596,1182 @@
     </w:p>
     <w:p>
       <w:pPr>
-        <w:pStyle w:val="ListParagraph"/>
-        <w:rPr>
-          <w:b/>
-          <w:bCs/>
+        <w:rPr>
+          <w:b/>
+          <w:bCs/>
+          <w:lang w:val="en-US"/>
+        </w:rPr>
+      </w:pPr>
+      <w:r>
+        <w:rPr>
+          <w:b/>
+          <w:bCs/>
+          <w:lang w:val="en-US"/>
+        </w:rPr>
+        <w:t>Functions</w:t>
+      </w:r>
+    </w:p>
+    <w:p>
+      <w:pPr>
+        <w:pStyle w:val="ListParagraph"/>
+        <w:numPr>
+          <w:ilvl w:val="0"/>
+          <w:numId w:val="1"/>
+        </w:numPr>
+        <w:rPr>
+          <w:lang w:val="en-US"/>
+        </w:rPr>
+      </w:pPr>
+      <w:r>
+        <w:rPr>
+          <w:lang w:val="en-US"/>
+        </w:rPr>
+        <w:t>Series of finite steps that accomplish some task</w:t>
+      </w:r>
+    </w:p>
+    <w:p>
+      <w:pPr>
+        <w:pStyle w:val="ListParagraph"/>
+        <w:numPr>
+          <w:ilvl w:val="0"/>
+          <w:numId w:val="1"/>
+        </w:numPr>
+        <w:rPr>
+          <w:lang w:val="en-US"/>
+        </w:rPr>
+      </w:pPr>
+      <w:r>
+        <w:rPr>
+          <w:lang w:val="en-US"/>
+        </w:rPr>
+        <w:t>Shorten &amp; simplify code for repetitive task</w:t>
+      </w:r>
+    </w:p>
+    <w:p>
+      <w:pPr>
+        <w:pStyle w:val="ListParagraph"/>
+        <w:numPr>
+          <w:ilvl w:val="0"/>
+          <w:numId w:val="1"/>
+        </w:numPr>
+        <w:rPr>
+          <w:lang w:val="en-US"/>
+        </w:rPr>
+      </w:pPr>
+      <w:r>
+        <w:rPr>
+          <w:lang w:val="en-US"/>
+        </w:rPr>
+        <w:t>Organize code in more meaningful way</w:t>
+      </w:r>
+    </w:p>
+    <w:p>
+      <w:pPr>
+        <w:pStyle w:val="ListParagraph"/>
+        <w:numPr>
+          <w:ilvl w:val="0"/>
+          <w:numId w:val="1"/>
+        </w:numPr>
+        <w:rPr>
+          <w:lang w:val="en-US"/>
+        </w:rPr>
+      </w:pPr>
+      <w:r>
+        <w:rPr>
+          <w:lang w:val="en-US"/>
+        </w:rPr>
+        <w:t>Define given task once and use throughout program</w:t>
+      </w:r>
+    </w:p>
+    <w:p>
+      <w:pPr>
+        <w:pStyle w:val="ListParagraph"/>
+        <w:numPr>
+          <w:ilvl w:val="0"/>
+          <w:numId w:val="1"/>
+        </w:numPr>
+        <w:rPr>
+          <w:lang w:val="en-US"/>
+        </w:rPr>
+      </w:pPr>
+      <w:r>
+        <w:rPr>
+          <w:lang w:val="en-US"/>
+        </w:rPr>
+        <w:t>Easily modify code via changing code in function instead of all code</w:t>
+      </w:r>
+    </w:p>
+    <w:p>
+      <w:pPr>
+        <w:pStyle w:val="ListParagraph"/>
+        <w:numPr>
+          <w:ilvl w:val="0"/>
+          <w:numId w:val="1"/>
+        </w:numPr>
+        <w:rPr>
+          <w:lang w:val="en-US"/>
+        </w:rPr>
+      </w:pPr>
+      <w:r>
+        <w:rPr>
+          <w:lang w:val="en-US"/>
+        </w:rPr>
+        <w:t>Functions created by self is known as user-defined functions</w:t>
+      </w:r>
+    </w:p>
+    <w:p>
+      <w:pPr>
+        <w:pStyle w:val="ListParagraph"/>
+        <w:numPr>
+          <w:ilvl w:val="0"/>
+          <w:numId w:val="1"/>
+        </w:numPr>
+        <w:rPr>
+          <w:lang w:val="en-US"/>
+        </w:rPr>
+      </w:pPr>
+      <w:r>
+        <w:rPr>
+          <w:lang w:val="en-US"/>
+        </w:rPr>
+        <w:t>Common functions are known as built-in functions (</w:t>
+      </w:r>
+      <w:proofErr w:type="spellStart"/>
+      <w:r>
+        <w:rPr>
+          <w:lang w:val="en-US"/>
+        </w:rPr>
+        <w:t>System.out.println</w:t>
+      </w:r>
+      <w:proofErr w:type="spellEnd"/>
+      <w:r>
+        <w:rPr>
+          <w:lang w:val="en-US"/>
+        </w:rPr>
+        <w:t>())</w:t>
+      </w:r>
+    </w:p>
+    <w:p>
+      <w:pPr>
+        <w:pStyle w:val="ListParagraph"/>
+        <w:numPr>
+          <w:ilvl w:val="1"/>
+          <w:numId w:val="1"/>
+        </w:numPr>
+        <w:rPr>
+          <w:lang w:val="en-US"/>
+        </w:rPr>
+      </w:pPr>
+      <w:r>
+        <w:rPr>
+          <w:lang w:val="en-US"/>
+        </w:rPr>
+        <w:t>Functions for strings</w:t>
+      </w:r>
+    </w:p>
+    <w:p>
+      <w:pPr>
+        <w:pStyle w:val="ListParagraph"/>
+        <w:numPr>
+          <w:ilvl w:val="1"/>
+          <w:numId w:val="1"/>
+        </w:numPr>
+        <w:rPr>
+          <w:lang w:val="en-US"/>
+        </w:rPr>
+      </w:pPr>
+      <w:r>
+        <w:rPr>
+          <w:lang w:val="en-US"/>
+        </w:rPr>
+        <w:t>Functions for int / double are all also built-in functions</w:t>
+      </w:r>
+    </w:p>
+    <w:p>
+      <w:pPr>
+        <w:pStyle w:val="ListParagraph"/>
+        <w:numPr>
+          <w:ilvl w:val="1"/>
+          <w:numId w:val="1"/>
+        </w:numPr>
+        <w:rPr>
+          <w:lang w:val="en-US"/>
+        </w:rPr>
+      </w:pPr>
+      <w:r>
+        <w:rPr>
+          <w:lang w:val="en-US"/>
+        </w:rPr>
+        <w:t>Called using dot operator</w:t>
+      </w:r>
+    </w:p>
+    <w:p>
+      <w:pPr>
+        <w:ind w:left="1080"/>
+        <w:rPr>
+          <w:lang w:val="en-US"/>
+        </w:rPr>
+      </w:pPr>
+    </w:p>
+    <w:p>
+      <w:pPr>
+        <w:rPr>
+          <w:b/>
+          <w:bCs/>
+          <w:lang w:val="en-US"/>
+        </w:rPr>
+      </w:pPr>
+      <w:r>
+        <w:rPr>
+          <w:b/>
+          <w:bCs/>
+          <w:lang w:val="en-US"/>
+        </w:rPr>
+        <w:t>Classes</w:t>
+      </w:r>
+    </w:p>
+    <w:p>
+      <w:pPr>
+        <w:pStyle w:val="ListParagraph"/>
+        <w:numPr>
+          <w:ilvl w:val="0"/>
+          <w:numId w:val="1"/>
+        </w:numPr>
+        <w:rPr>
+          <w:lang w:val="en-US"/>
+        </w:rPr>
+      </w:pPr>
+      <w:r>
+        <w:rPr>
+          <w:lang w:val="en-US"/>
+        </w:rPr>
+        <w:t>To make program easier to read</w:t>
+      </w:r>
+    </w:p>
+    <w:p>
+      <w:pPr>
+        <w:pStyle w:val="ListParagraph"/>
+        <w:numPr>
+          <w:ilvl w:val="0"/>
+          <w:numId w:val="1"/>
+        </w:numPr>
+        <w:rPr>
+          <w:lang w:val="en-US"/>
+        </w:rPr>
+      </w:pPr>
+      <w:r>
+        <w:rPr>
+          <w:lang w:val="en-US"/>
+        </w:rPr>
+        <w:t>Act as blueprint for objects</w:t>
+      </w:r>
+    </w:p>
+    <w:p>
+      <w:pPr>
+        <w:pStyle w:val="ListParagraph"/>
+        <w:numPr>
+          <w:ilvl w:val="0"/>
+          <w:numId w:val="1"/>
+        </w:numPr>
+        <w:rPr>
+          <w:lang w:val="en-US"/>
+        </w:rPr>
+      </w:pPr>
+      <w:r>
+        <w:rPr>
+          <w:lang w:val="en-US"/>
+        </w:rPr>
+        <w:t>User defined blueprint with set of attributes &amp; behaviors (methods) that define the item</w:t>
+      </w:r>
+    </w:p>
+    <w:p>
+      <w:pPr>
+        <w:pStyle w:val="ListParagraph"/>
+        <w:numPr>
+          <w:ilvl w:val="1"/>
+          <w:numId w:val="1"/>
+        </w:numPr>
+        <w:rPr>
+          <w:lang w:val="en-US"/>
+        </w:rPr>
+      </w:pPr>
+      <w:proofErr w:type="spellStart"/>
+      <w:r>
+        <w:rPr>
+          <w:lang w:val="en-US"/>
+        </w:rPr>
+        <w:t>Eg</w:t>
+      </w:r>
+      <w:proofErr w:type="spellEnd"/>
+      <w:r>
+        <w:rPr>
+          <w:lang w:val="en-US"/>
+        </w:rPr>
+        <w:t xml:space="preserve">: triangle: base + height + 3 sides of </w:t>
+      </w:r>
+      <w:r>
+        <w:rPr>
+          <w:lang w:val="en-US"/>
+        </w:rPr>
+        <w:t>length:</w:t>
+      </w:r>
+      <w:r>
+        <w:rPr>
+          <w:lang w:val="en-US"/>
+        </w:rPr>
+        <w:t xml:space="preserve"> Attributes</w:t>
+      </w:r>
+    </w:p>
+    <w:p>
+      <w:pPr>
+        <w:pStyle w:val="ListParagraph"/>
+        <w:numPr>
+          <w:ilvl w:val="1"/>
+          <w:numId w:val="1"/>
+        </w:numPr>
+        <w:rPr>
+          <w:lang w:val="en-US"/>
+        </w:rPr>
+      </w:pPr>
+      <w:r>
+        <w:rPr>
+          <w:lang w:val="en-US"/>
+        </w:rPr>
+        <w:t>Values may be different for different triangle</w:t>
+      </w:r>
+    </w:p>
+    <w:p>
+      <w:pPr>
+        <w:pStyle w:val="ListParagraph"/>
+        <w:numPr>
+          <w:ilvl w:val="1"/>
+          <w:numId w:val="1"/>
+        </w:numPr>
+        <w:rPr>
+          <w:lang w:val="en-US"/>
+        </w:rPr>
+      </w:pPr>
+      <w:r>
+        <w:rPr>
+          <w:lang w:val="en-US"/>
+        </w:rPr>
+        <w:t>Behavior = functions that can be used</w:t>
+      </w:r>
+    </w:p>
+    <w:p>
+      <w:pPr>
+        <w:pStyle w:val="ListParagraph"/>
+        <w:numPr>
+          <w:ilvl w:val="2"/>
+          <w:numId w:val="1"/>
+        </w:numPr>
+        <w:rPr>
+          <w:lang w:val="en-US"/>
+        </w:rPr>
+      </w:pPr>
+      <w:proofErr w:type="spellStart"/>
+      <w:r>
+        <w:rPr>
+          <w:lang w:val="en-US"/>
+        </w:rPr>
+        <w:t>Eg</w:t>
+      </w:r>
+      <w:proofErr w:type="spellEnd"/>
+      <w:r>
+        <w:rPr>
+          <w:lang w:val="en-US"/>
+        </w:rPr>
+        <w:t xml:space="preserve">: </w:t>
+      </w:r>
+      <w:proofErr w:type="spellStart"/>
+      <w:proofErr w:type="gramStart"/>
+      <w:r>
+        <w:rPr>
+          <w:lang w:val="en-US"/>
+        </w:rPr>
+        <w:t>findArea</w:t>
+      </w:r>
+      <w:proofErr w:type="spellEnd"/>
+      <w:r>
+        <w:rPr>
+          <w:lang w:val="en-US"/>
+        </w:rPr>
+        <w:t>(</w:t>
+      </w:r>
+      <w:proofErr w:type="gramEnd"/>
+      <w:r>
+        <w:rPr>
+          <w:lang w:val="en-US"/>
+        </w:rPr>
+        <w:t>)</w:t>
+      </w:r>
+    </w:p>
+    <w:p>
+      <w:pPr>
+        <w:pStyle w:val="ListParagraph"/>
+        <w:numPr>
+          <w:ilvl w:val="2"/>
+          <w:numId w:val="1"/>
+        </w:numPr>
+        <w:rPr>
+          <w:lang w:val="en-US"/>
+        </w:rPr>
+      </w:pPr>
+      <w:proofErr w:type="spellStart"/>
+      <w:r>
+        <w:rPr>
+          <w:lang w:val="en-US"/>
+        </w:rPr>
+        <w:t>findTriangleType</w:t>
+      </w:r>
+      <w:proofErr w:type="spellEnd"/>
+    </w:p>
+    <w:p>
+      <w:pPr>
+        <w:pStyle w:val="ListParagraph"/>
+        <w:numPr>
+          <w:ilvl w:val="0"/>
+          <w:numId w:val="1"/>
+        </w:numPr>
+        <w:rPr>
+          <w:lang w:val="en-US"/>
+        </w:rPr>
+      </w:pPr>
+      <w:r>
+        <w:rPr>
+          <w:lang w:val="en-US"/>
+        </w:rPr>
+        <w:t xml:space="preserve">Utilize </w:t>
+      </w:r>
+      <w:r>
+        <w:rPr>
+          <w:b/>
+          <w:bCs/>
+          <w:lang w:val="en-US"/>
+        </w:rPr>
+        <w:t>this</w:t>
+      </w:r>
+      <w:r>
+        <w:rPr>
+          <w:lang w:val="en-US"/>
+        </w:rPr>
+        <w:t xml:space="preserve"> keyword to specify the attributes to the parameters</w:t>
+      </w:r>
+    </w:p>
+    <w:p>
+      <w:pPr>
+        <w:pStyle w:val="ListParagraph"/>
+        <w:numPr>
+          <w:ilvl w:val="1"/>
+          <w:numId w:val="1"/>
+        </w:numPr>
+        <w:rPr>
+          <w:lang w:val="en-US"/>
+        </w:rPr>
+      </w:pPr>
+      <w:r>
+        <w:rPr>
+          <w:lang w:val="en-US"/>
+        </w:rPr>
+        <w:t>‘</w:t>
+      </w:r>
+      <w:r>
+        <w:rPr>
+          <w:lang w:val="en-US"/>
+        </w:rPr>
+        <w:t>this</w:t>
+      </w:r>
+      <w:r>
+        <w:rPr>
+          <w:lang w:val="en-US"/>
+        </w:rPr>
+        <w:t>’</w:t>
+      </w:r>
+      <w:r>
+        <w:rPr>
+          <w:lang w:val="en-US"/>
+        </w:rPr>
+        <w:t xml:space="preserve"> for attribute variable, linked to parameter variable</w:t>
+      </w:r>
+    </w:p>
+    <w:p>
+      <w:pPr>
+        <w:pStyle w:val="ListParagraph"/>
+        <w:numPr>
+          <w:ilvl w:val="1"/>
+          <w:numId w:val="1"/>
+        </w:numPr>
+        <w:rPr>
+          <w:lang w:val="en-US"/>
+        </w:rPr>
+      </w:pPr>
+      <w:r>
+        <w:rPr>
+          <w:lang w:val="en-US"/>
+        </w:rPr>
+        <w:t>Parameter names don’t have to be same name as attribute names but good to be same to be clear</w:t>
+      </w:r>
+    </w:p>
+    <w:p>
+      <w:pPr>
+        <w:pStyle w:val="ListParagraph"/>
+        <w:numPr>
+          <w:ilvl w:val="1"/>
+          <w:numId w:val="1"/>
+        </w:numPr>
+        <w:rPr>
+          <w:lang w:val="en-US"/>
+        </w:rPr>
+      </w:pPr>
+      <w:r>
+        <w:rPr>
+          <w:lang w:val="en-US"/>
+        </w:rPr>
+        <w:t>Attribute variables are also known as instance variables</w:t>
+      </w:r>
+    </w:p>
+    <w:p>
+      <w:pPr>
+        <w:pStyle w:val="ListParagraph"/>
+        <w:numPr>
+          <w:ilvl w:val="2"/>
+          <w:numId w:val="1"/>
+        </w:numPr>
+        <w:rPr>
+          <w:lang w:val="en-US"/>
+        </w:rPr>
+      </w:pPr>
+      <w:r>
+        <w:rPr>
+          <w:lang w:val="en-US"/>
+        </w:rPr>
+        <w:t xml:space="preserve">Can assign default values to instance variables but usually use constructor to </w:t>
+      </w:r>
+      <w:proofErr w:type="spellStart"/>
+      <w:r>
+        <w:rPr>
+          <w:lang w:val="en-US"/>
+        </w:rPr>
+        <w:t>init</w:t>
+      </w:r>
+      <w:proofErr w:type="spellEnd"/>
+      <w:r>
+        <w:rPr>
+          <w:lang w:val="en-US"/>
+        </w:rPr>
+        <w:t xml:space="preserve"> values</w:t>
+      </w:r>
+    </w:p>
+    <w:p>
+      <w:pPr>
+        <w:pStyle w:val="ListParagraph"/>
+        <w:numPr>
+          <w:ilvl w:val="1"/>
+          <w:numId w:val="1"/>
+        </w:numPr>
+        <w:rPr>
+          <w:lang w:val="en-US"/>
+        </w:rPr>
+      </w:pPr>
+      <w:r>
+        <w:rPr>
+          <w:lang w:val="en-US"/>
+        </w:rPr>
+        <w:t>Attributes accessible throughout triangle class</w:t>
+      </w:r>
+    </w:p>
+    <w:p>
+      <w:pPr>
+        <w:pStyle w:val="ListParagraph"/>
+        <w:numPr>
+          <w:ilvl w:val="1"/>
+          <w:numId w:val="1"/>
+        </w:numPr>
+        <w:rPr>
+          <w:lang w:val="en-US"/>
+        </w:rPr>
+      </w:pPr>
+      <w:r>
+        <w:rPr>
+          <w:lang w:val="en-US"/>
+        </w:rPr>
+        <w:t>Constructor parameters only accessible inside constructor</w:t>
+      </w:r>
+    </w:p>
+    <w:p>
+      <w:pPr>
+        <w:pStyle w:val="ListParagraph"/>
+        <w:numPr>
+          <w:ilvl w:val="0"/>
+          <w:numId w:val="1"/>
+        </w:numPr>
+        <w:rPr>
+          <w:lang w:val="en-US"/>
+        </w:rPr>
+      </w:pPr>
+      <w:r>
+        <w:rPr>
+          <w:lang w:val="en-US"/>
+        </w:rPr>
+        <w:t>By creating new class, a new datatype is created (essence of OOP)</w:t>
+      </w:r>
+    </w:p>
+    <w:p>
+      <w:pPr>
+        <w:rPr>
+          <w:lang w:val="en-US"/>
+        </w:rPr>
+      </w:pPr>
+      <w:r>
+        <w:rPr>
+          <w:b/>
+          <w:bCs/>
+          <w:lang w:val="en-US"/>
+        </w:rPr>
+        <w:t xml:space="preserve">Instance: </w:t>
+      </w:r>
+      <w:r>
+        <w:rPr>
+          <w:lang w:val="en-US"/>
+        </w:rPr>
+        <w:t>Object created from class blueprint</w:t>
+      </w:r>
+    </w:p>
+    <w:p>
+      <w:pPr>
+        <w:pStyle w:val="ListParagraph"/>
+        <w:numPr>
+          <w:ilvl w:val="0"/>
+          <w:numId w:val="1"/>
+        </w:numPr>
+        <w:rPr>
+          <w:lang w:val="en-US"/>
+        </w:rPr>
+      </w:pPr>
+      <w:proofErr w:type="spellStart"/>
+      <w:r>
+        <w:rPr>
+          <w:lang w:val="en-US"/>
+        </w:rPr>
+        <w:t>eg.</w:t>
+      </w:r>
+      <w:proofErr w:type="spellEnd"/>
+      <w:r>
+        <w:rPr>
+          <w:lang w:val="en-US"/>
+        </w:rPr>
+        <w:t xml:space="preserve"> </w:t>
+      </w:r>
+      <w:proofErr w:type="spellStart"/>
+      <w:r>
+        <w:rPr>
+          <w:lang w:val="en-US"/>
+        </w:rPr>
+        <w:t>TriangleA</w:t>
+      </w:r>
+      <w:proofErr w:type="spellEnd"/>
+      <w:r>
+        <w:rPr>
+          <w:lang w:val="en-US"/>
+        </w:rPr>
+        <w:t xml:space="preserve"> = 15 base, 8 height, </w:t>
+      </w:r>
+      <w:proofErr w:type="spellStart"/>
+      <w:r>
+        <w:rPr>
+          <w:lang w:val="en-US"/>
+        </w:rPr>
+        <w:t>sidelengths</w:t>
+      </w:r>
+      <w:proofErr w:type="spellEnd"/>
+      <w:r>
+        <w:rPr>
+          <w:lang w:val="en-US"/>
+        </w:rPr>
+        <w:t xml:space="preserve"> = 8cm</w:t>
+      </w:r>
+    </w:p>
+    <w:p>
+      <w:pPr>
+        <w:pStyle w:val="ListParagraph"/>
+        <w:numPr>
+          <w:ilvl w:val="0"/>
+          <w:numId w:val="1"/>
+        </w:numPr>
+        <w:rPr>
+          <w:lang w:val="en-US"/>
+        </w:rPr>
+      </w:pPr>
+      <w:r>
+        <w:rPr>
+          <w:lang w:val="en-US"/>
+        </w:rPr>
+        <w:t>Can assess instance attributes via dot operator</w:t>
+      </w:r>
+    </w:p>
+    <w:p>
+      <w:pPr>
+        <w:pStyle w:val="ListParagraph"/>
+        <w:numPr>
+          <w:ilvl w:val="0"/>
+          <w:numId w:val="1"/>
+        </w:numPr>
+        <w:rPr>
+          <w:lang w:val="en-US"/>
+        </w:rPr>
+      </w:pPr>
+      <w:proofErr w:type="spellStart"/>
+      <w:r>
+        <w:rPr>
+          <w:lang w:val="en-US"/>
+        </w:rPr>
+        <w:t>Eg.</w:t>
+      </w:r>
+      <w:proofErr w:type="spellEnd"/>
+      <w:r>
+        <w:rPr>
+          <w:lang w:val="en-US"/>
+        </w:rPr>
+        <w:t xml:space="preserve"> </w:t>
+      </w:r>
+      <w:proofErr w:type="spellStart"/>
+      <w:r>
+        <w:rPr>
+          <w:lang w:val="en-US"/>
+        </w:rPr>
+        <w:t>TriangleA.base</w:t>
+      </w:r>
+      <w:proofErr w:type="spellEnd"/>
+      <w:r>
+        <w:rPr>
+          <w:lang w:val="en-US"/>
+        </w:rPr>
+        <w:t xml:space="preserve"> etc. (attribute has no ())</w:t>
+      </w:r>
+    </w:p>
+    <w:p>
+      <w:pPr>
+        <w:rPr>
+          <w:lang w:val="en-US"/>
+        </w:rPr>
+      </w:pPr>
+      <w:r>
+        <w:rPr>
+          <w:b/>
+          <w:bCs/>
+          <w:lang w:val="en-US"/>
+        </w:rPr>
+        <w:t>Constructors</w:t>
+      </w:r>
+    </w:p>
+    <w:p>
+      <w:pPr>
+        <w:pStyle w:val="ListParagraph"/>
+        <w:numPr>
+          <w:ilvl w:val="0"/>
+          <w:numId w:val="1"/>
+        </w:numPr>
+        <w:rPr>
+          <w:lang w:val="en-US"/>
+        </w:rPr>
+      </w:pPr>
+      <w:r>
+        <w:rPr>
+          <w:lang w:val="en-US"/>
+        </w:rPr>
+        <w:t>used to create instances</w:t>
+      </w:r>
+    </w:p>
+    <w:p>
+      <w:pPr>
+        <w:pStyle w:val="ListParagraph"/>
+        <w:numPr>
+          <w:ilvl w:val="0"/>
+          <w:numId w:val="1"/>
+        </w:numPr>
+        <w:rPr>
+          <w:lang w:val="en-US"/>
+        </w:rPr>
+      </w:pPr>
+      <w:r>
+        <w:rPr>
+          <w:lang w:val="en-US"/>
+        </w:rPr>
+        <w:t>every class have a constructor</w:t>
+      </w:r>
+    </w:p>
+    <w:p>
+      <w:pPr>
+        <w:pStyle w:val="ListParagraph"/>
+        <w:numPr>
+          <w:ilvl w:val="0"/>
+          <w:numId w:val="1"/>
+        </w:numPr>
+        <w:rPr>
+          <w:lang w:val="en-US"/>
+        </w:rPr>
+      </w:pPr>
+      <w:r>
+        <w:rPr>
+          <w:lang w:val="en-US"/>
+        </w:rPr>
+        <w:t>special method in class and has same name as class</w:t>
+      </w:r>
+    </w:p>
+    <w:p>
+      <w:pPr>
+        <w:pStyle w:val="ListParagraph"/>
+        <w:numPr>
+          <w:ilvl w:val="0"/>
+          <w:numId w:val="1"/>
+        </w:numPr>
+        <w:rPr>
+          <w:lang w:val="en-US"/>
+        </w:rPr>
+      </w:pPr>
+      <w:proofErr w:type="gramStart"/>
+      <w:r>
+        <w:rPr>
+          <w:lang w:val="en-US"/>
+        </w:rPr>
+        <w:t>have to</w:t>
+      </w:r>
+      <w:proofErr w:type="gramEnd"/>
+      <w:r>
+        <w:rPr>
+          <w:lang w:val="en-US"/>
+        </w:rPr>
+        <w:t xml:space="preserve"> use </w:t>
+      </w:r>
+      <w:r>
+        <w:rPr>
+          <w:b/>
+          <w:bCs/>
+          <w:lang w:val="en-US"/>
+        </w:rPr>
+        <w:t>new</w:t>
+      </w:r>
+      <w:r>
+        <w:rPr>
+          <w:lang w:val="en-US"/>
+        </w:rPr>
+        <w:t xml:space="preserve"> keyword to call constructor</w:t>
+      </w:r>
+    </w:p>
+    <w:p>
+      <w:pPr>
+        <w:pStyle w:val="ListParagraph"/>
+        <w:numPr>
+          <w:ilvl w:val="0"/>
+          <w:numId w:val="1"/>
+        </w:numPr>
+        <w:rPr>
+          <w:lang w:val="en-US"/>
+        </w:rPr>
+      </w:pPr>
+      <w:r>
+        <w:rPr>
+          <w:lang w:val="en-US"/>
+        </w:rPr>
+        <w:t>constructor always return instance of class</w:t>
+      </w:r>
+    </w:p>
+    <w:p>
+      <w:pPr>
+        <w:pStyle w:val="ListParagraph"/>
+        <w:numPr>
+          <w:ilvl w:val="1"/>
+          <w:numId w:val="1"/>
+        </w:numPr>
+        <w:rPr>
+          <w:lang w:val="en-US"/>
+        </w:rPr>
+      </w:pPr>
+      <w:r>
+        <w:rPr>
+          <w:lang w:val="en-US"/>
+        </w:rPr>
+        <w:t>don’t have to state the return type or keyword as its built in Java</w:t>
+      </w:r>
+    </w:p>
+    <w:p>
+      <w:pPr>
+        <w:rPr>
+          <w:b/>
+          <w:bCs/>
+          <w:lang w:val="en-US"/>
+        </w:rPr>
+      </w:pPr>
+      <w:r>
+        <w:rPr>
+          <w:b/>
+          <w:bCs/>
+          <w:lang w:val="en-US"/>
+        </w:rPr>
+        <w:t>Instance Methods</w:t>
+      </w:r>
+    </w:p>
+    <w:p>
+      <w:pPr>
+        <w:pStyle w:val="ListParagraph"/>
+        <w:numPr>
+          <w:ilvl w:val="0"/>
+          <w:numId w:val="1"/>
+        </w:numPr>
+        <w:rPr>
+          <w:lang w:val="en-US"/>
+        </w:rPr>
+      </w:pPr>
+      <w:r>
+        <w:rPr>
+          <w:lang w:val="en-US"/>
+        </w:rPr>
+        <w:t>require attribute values of given instance</w:t>
+      </w:r>
+    </w:p>
+    <w:p>
+      <w:pPr>
+        <w:pStyle w:val="ListParagraph"/>
+        <w:numPr>
+          <w:ilvl w:val="0"/>
+          <w:numId w:val="1"/>
+        </w:numPr>
+        <w:rPr>
+          <w:lang w:val="en-US"/>
+        </w:rPr>
+      </w:pPr>
+      <w:r>
+        <w:rPr>
+          <w:lang w:val="en-US"/>
+        </w:rPr>
+        <w:t>non-static methods</w:t>
+      </w:r>
+      <w:r>
+        <w:rPr>
+          <w:lang w:val="en-US"/>
+        </w:rPr>
+        <w:t xml:space="preserve"> (need instance)</w:t>
+      </w:r>
+    </w:p>
+    <w:p>
+      <w:pPr>
+        <w:rPr>
+          <w:b/>
+          <w:bCs/>
+          <w:lang w:val="en-US"/>
+        </w:rPr>
+      </w:pPr>
+      <w:r>
+        <w:rPr>
+          <w:b/>
+          <w:bCs/>
+          <w:lang w:val="en-US"/>
+        </w:rPr>
+        <w:t>Static Methods</w:t>
+      </w:r>
+      <w:r>
+        <w:rPr>
+          <w:b/>
+          <w:bCs/>
+          <w:lang w:val="en-US"/>
+        </w:rPr>
+        <w:t xml:space="preserve"> (Class Methods)</w:t>
+      </w:r>
+    </w:p>
+    <w:p>
+      <w:pPr>
+        <w:pStyle w:val="ListParagraph"/>
+        <w:numPr>
+          <w:ilvl w:val="0"/>
+          <w:numId w:val="1"/>
+        </w:numPr>
+        <w:rPr>
+          <w:lang w:val="en-US"/>
+        </w:rPr>
+      </w:pPr>
+      <w:r>
+        <w:rPr>
+          <w:lang w:val="en-US"/>
+        </w:rPr>
+        <w:t>Does not need an instance / instance attribute to use function</w:t>
+      </w:r>
+    </w:p>
+    <w:p>
+      <w:pPr>
+        <w:rPr>
+          <w:b/>
+          <w:bCs/>
+          <w:lang w:val="en-US"/>
+        </w:rPr>
+      </w:pPr>
+      <w:r>
+        <w:rPr>
+          <w:b/>
+          <w:bCs/>
+          <w:lang w:val="en-US"/>
+        </w:rPr>
+        <w:t>Non-Static Variables</w:t>
+      </w:r>
+    </w:p>
+    <w:p>
+      <w:pPr>
+        <w:pStyle w:val="ListParagraph"/>
+        <w:numPr>
+          <w:ilvl w:val="0"/>
+          <w:numId w:val="1"/>
+        </w:numPr>
+        <w:rPr>
+          <w:b/>
+          <w:bCs/>
+          <w:lang w:val="en-US"/>
+        </w:rPr>
+      </w:pPr>
+      <w:r>
+        <w:rPr>
+          <w:lang w:val="en-US"/>
+        </w:rPr>
+        <w:t>Instance variables: values different for different instances</w:t>
+      </w:r>
+    </w:p>
+    <w:p>
+      <w:pPr>
+        <w:rPr>
+          <w:b/>
+          <w:bCs/>
+          <w:lang w:val="en-US"/>
+        </w:rPr>
+      </w:pPr>
+      <w:r>
+        <w:rPr>
+          <w:b/>
+          <w:bCs/>
+          <w:lang w:val="en-US"/>
+        </w:rPr>
+        <w:t>Static Variables</w:t>
+      </w:r>
+    </w:p>
+    <w:p>
+      <w:pPr>
+        <w:pStyle w:val="ListParagraph"/>
+        <w:numPr>
+          <w:ilvl w:val="0"/>
+          <w:numId w:val="1"/>
+        </w:numPr>
+        <w:rPr>
+          <w:lang w:val="en-US"/>
+        </w:rPr>
+      </w:pPr>
+      <w:r>
+        <w:rPr>
+          <w:lang w:val="en-US"/>
+        </w:rPr>
+        <w:t>Values does not change for all instance or affect all instance if change effected</w:t>
+      </w:r>
+    </w:p>
+    <w:p>
+      <w:pPr>
+        <w:pStyle w:val="ListParagraph"/>
+        <w:numPr>
+          <w:ilvl w:val="0"/>
+          <w:numId w:val="1"/>
+        </w:numPr>
+        <w:rPr>
+          <w:lang w:val="en-US"/>
+        </w:rPr>
+      </w:pPr>
+      <w:proofErr w:type="spellStart"/>
+      <w:r>
+        <w:rPr>
+          <w:lang w:val="en-US"/>
+        </w:rPr>
+        <w:lastRenderedPageBreak/>
+        <w:t>Eg</w:t>
+      </w:r>
+      <w:proofErr w:type="spellEnd"/>
+      <w:r>
+        <w:rPr>
+          <w:lang w:val="en-US"/>
+        </w:rPr>
+        <w:t>: class variables</w:t>
+      </w:r>
+    </w:p>
+    <w:p>
+      <w:pPr>
+        <w:pStyle w:val="ListParagraph"/>
+        <w:numPr>
+          <w:ilvl w:val="0"/>
+          <w:numId w:val="1"/>
+        </w:numPr>
+        <w:rPr>
+          <w:lang w:val="en-US"/>
+        </w:rPr>
+      </w:pPr>
+      <w:r>
+        <w:rPr>
+          <w:lang w:val="en-US"/>
+        </w:rPr>
+        <w:t>Can access class variable using dot operator on class name / any instance</w:t>
+      </w:r>
+    </w:p>
+    <w:p>
+      <w:pPr>
+        <w:pStyle w:val="ListParagraph"/>
+        <w:numPr>
+          <w:ilvl w:val="1"/>
+          <w:numId w:val="1"/>
+        </w:numPr>
+        <w:rPr>
+          <w:lang w:val="en-US"/>
+        </w:rPr>
+      </w:pPr>
+      <w:proofErr w:type="spellStart"/>
+      <w:r>
+        <w:rPr>
+          <w:lang w:val="en-US"/>
+        </w:rPr>
+        <w:t>Eg.</w:t>
+      </w:r>
+      <w:proofErr w:type="spellEnd"/>
+      <w:r>
+        <w:rPr>
+          <w:lang w:val="en-US"/>
+        </w:rPr>
+        <w:t xml:space="preserve"> </w:t>
+      </w:r>
+      <w:proofErr w:type="spellStart"/>
+      <w:r>
+        <w:rPr>
+          <w:lang w:val="en-US"/>
+        </w:rPr>
+        <w:t>Triangle.numOfSides</w:t>
+      </w:r>
+      <w:proofErr w:type="spellEnd"/>
+      <w:r>
+        <w:rPr>
+          <w:lang w:val="en-US"/>
+        </w:rPr>
+        <w:t xml:space="preserve"> | or </w:t>
+      </w:r>
+      <w:proofErr w:type="spellStart"/>
+      <w:r>
+        <w:rPr>
+          <w:lang w:val="en-US"/>
+        </w:rPr>
+        <w:t>triangleA.numOfSides</w:t>
+      </w:r>
+      <w:proofErr w:type="spellEnd"/>
+    </w:p>
+    <w:p>
+      <w:pPr>
+        <w:pStyle w:val="ListParagraph"/>
+        <w:rPr>
           <w:lang w:val="en-US"/>
         </w:rPr>
       </w:pPr>
     </w:p>
     <w:sectPr>
       <w:pgSz w:w="11906" w:h="16838"/>
-      <w:pgMar w:top="1440" w:right="1440" w:bottom="1440" w:left="1440" w:header="708" w:footer="708" w:gutter="0"/>
+      <w:pgMar w:top="1440" w:right="1440" w:bottom="1440" w:left="1440" w:header="709" w:footer="709" w:gutter="0"/>
       <w:cols w:space="708"/>
       <w:docGrid w:linePitch="360"/>
     </w:sectPr>

</xml_diff>